<commit_message>
tien do lab 7
</commit_message>
<xml_diff>
--- a/logs/VIET TAY/BaoCao_KetQua_Lab7.docx
+++ b/logs/VIET TAY/BaoCao_KetQua_Lab7.docx
@@ -77,15 +77,7 @@
           <w:sz w:val="26"/>
           <w:szCs w:val="26"/>
         </w:rPr>
-        <w:t xml:space="preserve">- </w:t>
-      </w:r>
-      <w:r>
-        <w:rPr>
-          <w:rFonts w:ascii="Times New Roman" w:hAnsi="Times New Roman" w:cs="Times New Roman"/>
-          <w:sz w:val="26"/>
-          <w:szCs w:val="26"/>
-        </w:rPr>
-        <w:t>Truy cập tab Actions, kiểm tra và chụp ảnh màn hình Workflow chạy thành công (Tích xanh Pass)</w:t>
+        <w:t>- Truy cập tab Actions, kiểm tra và chụp ảnh màn hình Workflow chạy thành công (Tích xanh Pass)</w:t>
       </w:r>
       <w:r>
         <w:rPr>
@@ -98,6 +90,7 @@
       <w:r>
         <w:rPr>
           <w:rFonts w:ascii="Times New Roman" w:hAnsi="Times New Roman" w:cs="Times New Roman"/>
+          <w:noProof/>
           <w:sz w:val="26"/>
           <w:szCs w:val="26"/>
         </w:rPr>
@@ -126,6 +119,82 @@
                     <a:xfrm>
                       <a:off x="0" y="0"/>
                       <a:ext cx="5943600" cy="2626360"/>
+                    </a:xfrm>
+                    <a:prstGeom prst="rect">
+                      <a:avLst/>
+                    </a:prstGeom>
+                  </pic:spPr>
+                </pic:pic>
+              </a:graphicData>
+            </a:graphic>
+          </wp:inline>
+        </w:drawing>
+      </w:r>
+    </w:p>
+    <w:p>
+      <w:pPr>
+        <w:rPr>
+          <w:rFonts w:ascii="Times New Roman" w:hAnsi="Times New Roman" w:cs="Times New Roman"/>
+          <w:sz w:val="26"/>
+          <w:szCs w:val="26"/>
+        </w:rPr>
+      </w:pPr>
+      <w:r>
+        <w:rPr>
+          <w:rFonts w:ascii="Times New Roman" w:hAnsi="Times New Roman" w:cs="Times New Roman"/>
+          <w:sz w:val="26"/>
+          <w:szCs w:val="26"/>
+        </w:rPr>
+        <w:t xml:space="preserve">- </w:t>
+      </w:r>
+      <w:r>
+        <w:rPr>
+          <w:rFonts w:ascii="Times New Roman" w:hAnsi="Times New Roman" w:cs="Times New Roman"/>
+          <w:sz w:val="26"/>
+          <w:szCs w:val="26"/>
+        </w:rPr>
+        <w:t>Cập nhật tập tin .github/workflows/yummyapp-ci.yml, thêm bước Linter và ngưỡng Coverage ≥ 80%</w:t>
+      </w:r>
+    </w:p>
+    <w:p>
+      <w:pPr>
+        <w:rPr>
+          <w:rFonts w:ascii="Times New Roman" w:hAnsi="Times New Roman" w:cs="Times New Roman"/>
+          <w:sz w:val="26"/>
+          <w:szCs w:val="26"/>
+        </w:rPr>
+      </w:pPr>
+      <w:r>
+        <w:rPr>
+          <w:rFonts w:ascii="Times New Roman" w:hAnsi="Times New Roman" w:cs="Times New Roman"/>
+          <w:sz w:val="26"/>
+          <w:szCs w:val="26"/>
+        </w:rPr>
+        <w:drawing>
+          <wp:inline distT="0" distB="0" distL="0" distR="0" wp14:anchorId="62EE11C1" wp14:editId="4A9DF5C9">
+            <wp:extent cx="5943600" cy="2686050"/>
+            <wp:effectExtent l="0" t="0" r="0" b="0"/>
+            <wp:docPr id="1333218031" name="Picture 1"/>
+            <wp:cNvGraphicFramePr>
+              <a:graphicFrameLocks xmlns:a="http://schemas.openxmlformats.org/drawingml/2006/main" noChangeAspect="1"/>
+            </wp:cNvGraphicFramePr>
+            <a:graphic xmlns:a="http://schemas.openxmlformats.org/drawingml/2006/main">
+              <a:graphicData uri="http://schemas.openxmlformats.org/drawingml/2006/picture">
+                <pic:pic xmlns:pic="http://schemas.openxmlformats.org/drawingml/2006/picture">
+                  <pic:nvPicPr>
+                    <pic:cNvPr id="1333218031" name=""/>
+                    <pic:cNvPicPr/>
+                  </pic:nvPicPr>
+                  <pic:blipFill>
+                    <a:blip r:embed="rId6"/>
+                    <a:stretch>
+                      <a:fillRect/>
+                    </a:stretch>
+                  </pic:blipFill>
+                  <pic:spPr>
+                    <a:xfrm>
+                      <a:off x="0" y="0"/>
+                      <a:ext cx="5943600" cy="2686050"/>
                     </a:xfrm>
                     <a:prstGeom prst="rect">
                       <a:avLst/>

</xml_diff>